<commit_message>
Worked on multiple merge functions and UI
</commit_message>
<xml_diff>
--- a/project/documents/letters/ProvisionalAssignmentNoLabel.docx
+++ b/project/documents/letters/ProvisionalAssignmentNoLabel.docx
@@ -3,191 +3,59 @@
 <w:document xmlns:wpc="http://schemas.microsoft.com/office/word/2010/wordprocessingCanvas" xmlns:cx="http://schemas.microsoft.com/office/drawing/2014/chartex" xmlns:cx1="http://schemas.microsoft.com/office/drawing/2015/9/8/chartex" xmlns:cx2="http://schemas.microsoft.com/office/drawing/2015/10/21/chartex" xmlns:cx3="http://schemas.microsoft.com/office/drawing/2016/5/9/chartex" xmlns:cx4="http://schemas.microsoft.com/office/drawing/2016/5/10/chartex" xmlns:cx5="http://schemas.microsoft.com/office/drawing/2016/5/11/chartex" xmlns:cx6="http://schemas.microsoft.com/office/drawing/2016/5/12/chartex" xmlns:cx7="http://schemas.microsoft.com/office/drawing/2016/5/13/chartex" xmlns:cx8="http://schemas.microsoft.com/office/drawing/2016/5/14/chartex" xmlns:mc="http://schemas.openxmlformats.org/markup-compatibility/2006" xmlns:aink="http://schemas.microsoft.com/office/drawing/2016/ink" xmlns:am3d="http://schemas.microsoft.com/office/drawing/2017/model3d" xmlns:o="urn:schemas-microsoft-com:office:office" xmlns:oel="http://schemas.microsoft.com/office/2019/extlst" xmlns:r="http://schemas.openxmlformats.org/officeDocument/2006/relationships" xmlns:m="http://schemas.openxmlformats.org/officeDocument/2006/math" xmlns:v="urn:schemas-microsoft-com:vml" xmlns:wp14="http://schemas.microsoft.com/office/word/2010/wordprocessingDrawing" xmlns:wp="http://schemas.openxmlformats.org/drawingml/2006/wordprocessingDrawing" xmlns:w10="urn:schemas-microsoft-com:office:word" xmlns:w="http://schemas.openxmlformats.org/wordprocessingml/2006/main" xmlns:w14="http://schemas.microsoft.com/office/word/2010/wordml" xmlns:w15="http://schemas.microsoft.com/office/word/2012/wordml" xmlns:w16cex="http://schemas.microsoft.com/office/word/2018/wordml/cex" xmlns:w16cid="http://schemas.microsoft.com/office/word/2016/wordml/cid" xmlns:w16="http://schemas.microsoft.com/office/word/2018/wordml" xmlns:w16sdtdh="http://schemas.microsoft.com/office/word/2020/wordml/sdtdatahash" xmlns:w16se="http://schemas.microsoft.com/office/word/2015/wordml/symex" xmlns:wpg="http://schemas.microsoft.com/office/word/2010/wordprocessingGroup" xmlns:wpi="http://schemas.microsoft.com/office/word/2010/wordprocessingInk" xmlns:wne="http://schemas.microsoft.com/office/word/2006/wordml" xmlns:wps="http://schemas.microsoft.com/office/word/2010/wordprocessingShape" mc:Ignorable="w14 w15 w16se w16cid w16 w16cex w16sdtdh wp14">
   <w:body>
     <w:p>
-      <w:pPr>
-        <w:tabs>
-          <w:tab w:val="right" w:pos="9360"/>
-        </w:tabs>
-        <w:rPr>
-          <w:b/>
-          <w:bCs/>
-          <w:sz w:val="24"/>
-        </w:rPr>
-      </w:pPr>
-    </w:p>
-    <w:p>
-      <w:pPr>
-        <w:tabs>
-          <w:tab w:val="right" w:pos="9360"/>
-        </w:tabs>
-        <w:rPr>
-          <w:szCs w:val="20"/>
-        </w:rPr>
-      </w:pPr>
-      <w:r>
-        <w:rPr>
-          <w:b/>
-          <w:bCs/>
-          <w:szCs w:val="20"/>
-        </w:rPr>
-        <w:t>&lt;&lt;WAName&gt;&gt; &lt;&lt;WAPhone&gt;&gt; - Direct Dial</w:t>
-      </w:r>
-      <w:r>
-        <w:rPr>
-          <w:b/>
-          <w:bCs/>
-          <w:szCs w:val="20"/>
-        </w:rPr>
-        <w:tab/>
-        <w:t>&lt;&lt;paraName&gt;&gt; &lt;&lt;paraPhone&gt;&gt; - Direct Dial</w:t>
-      </w:r>
-    </w:p>
-    <w:p>
-      <w:pPr>
-        <w:tabs>
-          <w:tab w:val="right" w:pos="9360"/>
-        </w:tabs>
-        <w:rPr>
-          <w:szCs w:val="20"/>
-        </w:rPr>
-      </w:pPr>
-      <w:r>
-        <w:rPr>
-          <w:b/>
-          <w:bCs/>
-          <w:szCs w:val="20"/>
-        </w:rPr>
-        <w:t>&lt;&lt;WAEmail&gt;&gt;</w:t>
-      </w:r>
-      <w:r>
-        <w:rPr>
-          <w:b/>
-          <w:bCs/>
-          <w:szCs w:val="20"/>
-        </w:rPr>
-        <w:tab/>
-        <w:t>&lt;&lt;paraEmail&gt;&gt;</w:t>
-      </w:r>
-    </w:p>
-    <w:p>
-      <w:pPr>
-        <w:rPr>
-          <w:b/>
-          <w:bCs/>
-          <w:sz w:val="24"/>
-        </w:rPr>
-      </w:pPr>
-    </w:p>
-    <w:p>
-      <w:pPr>
-        <w:rPr>
-          <w:sz w:val="22"/>
-          <w:szCs w:val="22"/>
-        </w:rPr>
-      </w:pPr>
-      <w:r>
-        <w:rPr>
-          <w:sz w:val="22"/>
-          <w:szCs w:val="22"/>
-        </w:rPr>
-        <w:t>&lt;&lt;currentDate&gt;&gt;</w:t>
-      </w:r>
-    </w:p>
-    <w:p>
-      <w:pPr>
-        <w:rPr>
-          <w:sz w:val="22"/>
-          <w:szCs w:val="22"/>
-        </w:rPr>
-      </w:pPr>
-    </w:p>
-    <w:p>
-      <w:pPr>
-        <w:tabs>
-          <w:tab w:val="left" w:pos="-1440"/>
-        </w:tabs>
-        <w:rPr>
-          <w:sz w:val="22"/>
-          <w:szCs w:val="22"/>
-        </w:rPr>
-      </w:pPr>
-      <w:r>
-        <w:rPr>
-          <w:sz w:val="22"/>
-          <w:szCs w:val="22"/>
-        </w:rPr>
-        <w:t>&lt;&lt;recipient&gt;&gt;</w:t>
-      </w:r>
-    </w:p>
-    <w:p>
-      <w:pPr>
-        <w:tabs>
-          <w:tab w:val="left" w:pos="-1440"/>
-        </w:tabs>
-        <w:rPr>
-          <w:sz w:val="22"/>
-          <w:szCs w:val="22"/>
-        </w:rPr>
-      </w:pPr>
-      <w:r>
-        <w:rPr>
-          <w:sz w:val="22"/>
-          <w:szCs w:val="22"/>
-        </w:rPr>
-        <w:t>&lt;&lt;corrContactTitle&gt;&gt;</w:t>
-      </w:r>
-    </w:p>
-    <w:p>
-      <w:pPr>
-        <w:tabs>
-          <w:tab w:val="left" w:pos="-1440"/>
-        </w:tabs>
-        <w:rPr>
-          <w:sz w:val="22"/>
-          <w:szCs w:val="22"/>
-        </w:rPr>
-      </w:pPr>
-      <w:r>
-        <w:rPr>
-          <w:sz w:val="22"/>
-          <w:szCs w:val="22"/>
-        </w:rPr>
-        <w:t>&lt;&lt;orgName&gt;&gt;</w:t>
-      </w:r>
-    </w:p>
-    <w:p>
-      <w:pPr>
-        <w:tabs>
-          <w:tab w:val="right" w:pos="9360"/>
-        </w:tabs>
-        <w:rPr>
-          <w:sz w:val="22"/>
-          <w:szCs w:val="22"/>
-        </w:rPr>
-      </w:pPr>
-      <w:r>
-        <w:rPr>
-          <w:sz w:val="22"/>
-          <w:szCs w:val="22"/>
-        </w:rPr>
-        <w:t>&lt;&lt;workAddr&gt;&gt;</w:t>
-      </w:r>
-    </w:p>
-    <w:p>
-      <w:pPr>
-        <w:tabs>
-          <w:tab w:val="right" w:pos="9360"/>
-        </w:tabs>
-        <w:rPr>
-          <w:sz w:val="22"/>
-          <w:szCs w:val="22"/>
-        </w:rPr>
-      </w:pPr>
-      <w:r>
-        <w:rPr>
-          <w:sz w:val="22"/>
-          <w:szCs w:val="22"/>
-        </w:rPr>
-        <w:t>&lt;&lt;CSZ&gt;&gt;</w:t>
+      <w:r>
+        <w:t>Subject line: &lt;&lt;This.orgName&gt;&gt; &lt;&lt;This.clientRefNo&gt;&gt; / SLW Ref: &lt;&lt;This.matterNo&gt;&gt; / SLW Report out: &lt;&lt;activityname&gt;&gt;</w:t>
+      </w:r>
+    </w:p>
+    <w:p>
+      <w:pPr>
+        <w:pStyle w:val="NormalWeb"/>
+      </w:pPr>
+      <w:r>
+        <w:t>Body of email:</w:t>
+      </w:r>
+    </w:p>
+    <w:p>
+      <w:pPr>
+        <w:pStyle w:val="NormalWeb"/>
+      </w:pPr>
+    </w:p>
+    <w:p>
+      <w:pPr>
+        <w:pStyle w:val="NormalWeb"/>
+      </w:pPr>
+    </w:p>
+    <w:p>
+      <w:pPr>
+        <w:pStyle w:val="NormalWeb"/>
+      </w:pPr>
+    </w:p>
+    <w:p>
+      <w:pPr>
+        <w:pStyle w:val="NormalWeb"/>
+      </w:pPr>
+    </w:p>
+    <w:p>
+      <w:pPr>
+        <w:pStyle w:val="NormalWeb"/>
+      </w:pPr>
+      <w:r>
+        <w:t xml:space="preserve">SCHWEGMAN LUNDBERG &amp; WOESSNER, P.A. </w:t>
+      </w:r>
+    </w:p>
+    <w:p>
+      <w:pPr>
+        <w:pStyle w:val="NormalWeb"/>
+      </w:pPr>
+    </w:p>
+    <w:p>
+      <w:r>
+        <w:t>&lt;&lt;This.WAName&gt;&gt; &lt;&lt;This.WAPhone&gt;&gt;  &lt;&lt;This.WAEmail&gt;&gt;</w:t>
+      </w:r>
+    </w:p>
+    <w:p>
+      <w:r>
+        <w:t>&lt;&lt;This.paraName&gt;&gt; &lt;&lt;This.paraPhone&gt;&gt;  &lt;&lt;This.paraEmail&gt;&gt;</w:t>
       </w:r>
     </w:p>
     <w:p>
@@ -294,43 +162,16 @@
     <w:p>
       <w:pPr>
         <w:rPr>
+          <w:sz w:val="24"/>
+        </w:rPr>
+      </w:pPr>
+      <w:r>
+        <w:rPr>
           <w:noProof/>
           <w:sz w:val="24"/>
         </w:rPr>
-      </w:pPr>
-    </w:p>
-    <w:p>
-      <w:pPr>
-        <w:rPr>
-          <w:sz w:val="24"/>
-        </w:rPr>
-      </w:pPr>
-      <w:r>
-        <w:rPr>
-          <w:sz w:val="24"/>
-        </w:rPr>
-        <w:t xml:space="preserve">Dear </w:t>
-      </w:r>
-      <w:r>
-        <w:rPr>
-          <w:noProof/>
-          <w:sz w:val="24"/>
-        </w:rPr>
         <w:t>&lt;&lt;salutation&gt;&gt;</w:t>
       </w:r>
-      <w:r>
-        <w:rPr>
-          <w:sz w:val="24"/>
-        </w:rPr>
-        <w:t>:</w:t>
-      </w:r>
-    </w:p>
-    <w:p>
-      <w:pPr>
-        <w:rPr>
-          <w:sz w:val="24"/>
-        </w:rPr>
-      </w:pPr>
     </w:p>
     <w:p>
       <w:pPr>
@@ -559,87 +400,6 @@
           <w:sz w:val="24"/>
         </w:rPr>
         <w:t>.</w:t>
-      </w:r>
-    </w:p>
-    <w:p>
-      <w:pPr>
-        <w:rPr>
-          <w:sz w:val="24"/>
-        </w:rPr>
-      </w:pPr>
-    </w:p>
-    <w:p>
-      <w:pPr>
-        <w:rPr>
-          <w:sz w:val="24"/>
-        </w:rPr>
-      </w:pPr>
-      <w:r>
-        <w:rPr>
-          <w:sz w:val="24"/>
-        </w:rPr>
-        <w:t>Very truly yours,</w:t>
-      </w:r>
-    </w:p>
-    <w:p>
-      <w:pPr>
-        <w:rPr>
-          <w:sz w:val="24"/>
-        </w:rPr>
-      </w:pPr>
-    </w:p>
-    <w:p>
-      <w:pPr>
-        <w:rPr>
-          <w:sz w:val="24"/>
-        </w:rPr>
-      </w:pPr>
-    </w:p>
-    <w:p>
-      <w:pPr>
-        <w:rPr>
-          <w:sz w:val="24"/>
-        </w:rPr>
-      </w:pPr>
-      <w:r>
-        <w:rPr>
-          <w:color w:val="000000"/>
-          <w:sz w:val="24"/>
-        </w:rPr>
-        <w:t>&lt;&lt;cmgName&gt;&gt;</w:t>
-      </w:r>
-    </w:p>
-    <w:p>
-      <w:pPr>
-        <w:rPr>
-          <w:sz w:val="24"/>
-        </w:rPr>
-      </w:pPr>
-      <w:r>
-        <w:rPr>
-          <w:sz w:val="24"/>
-        </w:rPr>
-        <w:t>Case Management Assistant</w:t>
-      </w:r>
-    </w:p>
-    <w:p>
-      <w:pPr>
-        <w:rPr>
-          <w:sz w:val="24"/>
-        </w:rPr>
-      </w:pPr>
-    </w:p>
-    <w:p>
-      <w:pPr>
-        <w:rPr>
-          <w:sz w:val="24"/>
-        </w:rPr>
-      </w:pPr>
-      <w:r>
-        <w:rPr>
-          <w:sz w:val="24"/>
-        </w:rPr>
-        <w:t>Enclosure</w:t>
       </w:r>
     </w:p>
     <w:p/>
@@ -1236,6 +996,25 @@
       <w:szCs w:val="24"/>
     </w:rPr>
   </w:style>
+  <w:style w:type="paragraph" w:styleId="NormalWeb">
+    <w:name w:val="Normal (Web)"/>
+    <w:basedOn w:val="Normal"/>
+    <w:uiPriority w:val="99"/>
+    <w:unhideWhenUsed/>
+    <w:rsid w:val="003232B7"/>
+    <w:pPr>
+      <w:widowControl/>
+      <w:autoSpaceDE/>
+      <w:autoSpaceDN/>
+      <w:adjustRightInd/>
+      <w:spacing w:before="100" w:beforeAutospacing="1" w:after="100" w:afterAutospacing="1"/>
+    </w:pPr>
+    <w:rPr>
+      <w:rFonts w:ascii="Calibri" w:eastAsia="Calibri" w:hAnsi="Calibri" w:cs="Calibri"/>
+      <w:sz w:val="22"/>
+      <w:szCs w:val="22"/>
+    </w:rPr>
+  </w:style>
 </w:styles>
 </file>
 

</xml_diff>